<commit_message>
Portal: páginas Avisos e e-mails e Administração da plataforma (EN/PT) com capturas da conta de verdade; status do Crew e das concorrências atualizados
Acertos vistos nas capturas: nome do plano e situação 'Teste' no idioma, perfil, ações e tipos de e-mail traduzidos na administração, espaçamentos, e-mail no mock de auth.

Co-Authored-By: Claude Sonnet 5.5 <noreply@anthropic.com>
Claude-Session: https://claude.ai/code/session_01Ep8bJsuQq2bqGePCMzzux2
</commit_message>
<xml_diff>
--- a/portal/files/KORbuild Bids - Prototype status.docx
+++ b/portal/files/KORbuild Bids - Prototype status.docx
@@ -176,7 +176,23 @@
                 <w:i w:val="0"/>
                 <w:sz w:val="18"/>
               </w:rPr>
-              <w:t>The invitation link is generated by the database when you send (only its hash is stored) and shown once, to copy; it stays saved on the device that sent it. Email delivery is the next stage.</w:t>
+              <w:t xml:space="preserve">The invitation link is generated by the database when you send (only its hash is stored) and shown once, to copy; it stays saved on the device that sent it. The invitation is also </w:t>
+            </w:r>
+            <w:r>
+              <w:rPr>
+                <w:b/>
+                <w:i w:val="0"/>
+                <w:sz w:val="18"/>
+              </w:rPr>
+              <w:t>emailed</w:t>
+            </w:r>
+            <w:r>
+              <w:rPr>
+                <w:b w:val="0"/>
+                <w:i w:val="0"/>
+                <w:sz w:val="18"/>
+              </w:rPr>
+              <w:t xml:space="preserve"> to the invitee (see Notifications and email).</w:t>
             </w:r>
           </w:p>
         </w:tc>
@@ -627,7 +643,7 @@
                 <w:i w:val="0"/>
                 <w:sz w:val="18"/>
               </w:rPr>
-              <w:t xml:space="preserve">Sent by email, with the private link (next stage; the link itself </w:t>
+              <w:t xml:space="preserve">Sent by email, with the private link — </w:t>
             </w:r>
             <w:r>
               <w:rPr>
@@ -635,7 +651,7 @@
                 <w:i w:val="0"/>
                 <w:sz w:val="18"/>
               </w:rPr>
-              <w:t>already works</w:t>
+              <w:t>already running</w:t>
             </w:r>
             <w:r>
               <w:rPr>
@@ -643,7 +659,7 @@
                 <w:i w:val="0"/>
                 <w:sz w:val="18"/>
               </w:rPr>
-              <w:t>).</w:t>
+              <w:t xml:space="preserve"> in the real account.</w:t>
             </w:r>
           </w:p>
         </w:tc>
@@ -1022,40 +1038,6 @@
                 <w:i w:val="0"/>
                 <w:sz w:val="18"/>
               </w:rPr>
-              <w:t>Invitations and notices by email</w:t>
-            </w:r>
-          </w:p>
-        </w:tc>
-        <w:tc>
-          <w:tcPr>
-            <w:tcW w:type="dxa" w:w="4873"/>
-          </w:tcPr>
-          <w:p>
-            <w:r/>
-            <w:r>
-              <w:rPr>
-                <w:b w:val="0"/>
-                <w:i w:val="0"/>
-                <w:sz w:val="18"/>
-              </w:rPr>
-              <w:t>The next stage of the database work.</w:t>
-            </w:r>
-          </w:p>
-        </w:tc>
-      </w:tr>
-      <w:tr>
-        <w:tc>
-          <w:tcPr>
-            <w:tcW w:type="dxa" w:w="4873"/>
-          </w:tcPr>
-          <w:p>
-            <w:r/>
-            <w:r>
-              <w:rPr>
-                <w:b w:val="0"/>
-                <w:i w:val="0"/>
-                <w:sz w:val="18"/>
-              </w:rPr>
               <w:t>Sealed bids</w:t>
             </w:r>
           </w:p>

</xml_diff>